<commit_message>
Link the published Tableau dashboard from README and brief; remove build guide
Co-Authored-By: Claude Opus 5.5 <noreply@anthropic.com>
Claude-Session: https://claude.ai/code/session_01HZdyzhCe5MdgiAPTu7zGHT
</commit_message>
<xml_diff>
--- a/reports/NNA_Weekly_Brief_3Q26.docx
+++ b/reports/NNA_Weekly_Brief_3Q26.docx
@@ -1729,7 +1729,7 @@
         </w:rPr>
         <w:t xml:space="preserve">Sources: </w:t>
       </w:r>
-      <w:hyperlink w:history="1" r:id="rIdmym-scdmwhorod0k_vuod">
+      <w:hyperlink w:history="1" r:id="rIda8yb4ta9l0axocssqhzoe">
         <w:r>
           <w:rPr>
             <w:rFonts w:ascii="Calibri" w:cs="Calibri" w:eastAsia="Calibri" w:hAnsi="Calibri"/>
@@ -1750,7 +1750,7 @@
         </w:rPr>
         <w:t xml:space="preserve"> · </w:t>
       </w:r>
-      <w:hyperlink w:history="1" r:id="rIdnsb5q6zb_8xadrz1roz9p">
+      <w:hyperlink w:history="1" r:id="rIdo09erialk0s4fvmosms_r">
         <w:r>
           <w:rPr>
             <w:rFonts w:ascii="Calibri" w:cs="Calibri" w:eastAsia="Calibri" w:hAnsi="Calibri"/>
@@ -1771,7 +1771,7 @@
         </w:rPr>
         <w:t xml:space="preserve"> · </w:t>
       </w:r>
-      <w:hyperlink w:history="1" r:id="rIdabbhy0t-tavqfg9zczrc5">
+      <w:hyperlink w:history="1" r:id="rId8dpmobm7z-ysbnxaiuen_">
         <w:r>
           <w:rPr>
             <w:rFonts w:ascii="Calibri" w:cs="Calibri" w:eastAsia="Calibri" w:hAnsi="Calibri"/>
@@ -1792,7 +1792,7 @@
         </w:rPr>
         <w:t xml:space="preserve"> · </w:t>
       </w:r>
-      <w:hyperlink w:history="1" r:id="rIdx7cxtaeau93wf-3fiopl3">
+      <w:hyperlink w:history="1" r:id="rIdkydtzrwsuccf8idmibqad">
         <w:r>
           <w:rPr>
             <w:rFonts w:ascii="Calibri" w:cs="Calibri" w:eastAsia="Calibri" w:hAnsi="Calibri"/>
@@ -1813,7 +1813,7 @@
         </w:rPr>
         <w:t xml:space="preserve"> · </w:t>
       </w:r>
-      <w:hyperlink w:history="1" r:id="rIdfvvfgjwxysl0yavmt2gzb">
+      <w:hyperlink w:history="1" r:id="rIdghi0kgdqyd7rqj0y6iwj-">
         <w:r>
           <w:rPr>
             <w:rFonts w:ascii="Calibri" w:cs="Calibri" w:eastAsia="Calibri" w:hAnsi="Calibri"/>
@@ -1834,7 +1834,7 @@
         </w:rPr>
         <w:t xml:space="preserve"> · </w:t>
       </w:r>
-      <w:hyperlink w:history="1" r:id="rId3f6-e_twoqf4vsl0upool">
+      <w:hyperlink w:history="1" r:id="rIduldphchzodgfi_zlpzkei">
         <w:r>
           <w:rPr>
             <w:rFonts w:ascii="Calibri" w:cs="Calibri" w:eastAsia="Calibri" w:hAnsi="Calibri"/>
@@ -1855,7 +1855,7 @@
         </w:rPr>
         <w:t xml:space="preserve"> · </w:t>
       </w:r>
-      <w:hyperlink w:history="1" r:id="rIdmfage_oekbvu9g-bftyqk">
+      <w:hyperlink w:history="1" r:id="rIdbwu6ead6gjz9nsepe3bgd">
         <w:r>
           <w:rPr>
             <w:rFonts w:ascii="Calibri" w:cs="Calibri" w:eastAsia="Calibri" w:hAnsi="Calibri"/>
@@ -1865,6 +1865,27 @@
             <w:u w:val="single"/>
           </w:rPr>
           <w:t xml:space="preserve">Code &amp; data</w:t>
+        </w:r>
+      </w:hyperlink>
+      <w:r>
+        <w:rPr>
+          <w:rFonts w:ascii="Calibri" w:cs="Calibri" w:eastAsia="Calibri" w:hAnsi="Calibri"/>
+          <w:color w:val="5A5A5A"/>
+          <w:sz w:val="16"/>
+          <w:szCs w:val="16"/>
+        </w:rPr>
+        <w:t xml:space="preserve"> · </w:t>
+      </w:r>
+      <w:hyperlink w:history="1" r:id="rIdnrugcjihymvvt77ikvved">
+        <w:r>
+          <w:rPr>
+            <w:rFonts w:ascii="Calibri" w:cs="Calibri" w:eastAsia="Calibri" w:hAnsi="Calibri"/>
+            <w:color w:val="1F5FAD"/>
+            <w:sz w:val="16"/>
+            <w:szCs w:val="16"/>
+            <w:u w:val="single"/>
+          </w:rPr>
+          <w:t xml:space="preserve">Interactive dashboard</w:t>
         </w:r>
       </w:hyperlink>
     </w:p>

</xml_diff>